<commit_message>
feat: add Project Status comparison
</commit_message>
<xml_diff>
--- a/Documentos/Comparar PS y programa.docx
+++ b/Documentos/Comparar PS y programa.docx
@@ -19,7 +19,1269 @@
         <w:rPr>
           <w:lang w:val="es-419"/>
         </w:rPr>
-        <w:t>Estos cambios, no quiero que los hagas en la seccion que se llama "Todas las partidas", unicamente queria que lo realizaras a la seccion de entrada de datos en partidas, antes de hacer nada, dime lo que entiendes por lo que te digo</w:t>
+        <w:t>Hacer una sección para comparar l</w:t>
+      </w:r>
+      <w:r>
+        <w:rPr>
+          <w:lang w:val="es-419"/>
+        </w:rPr>
+        <w:t xml:space="preserve">os resultados del programa con el </w:t>
+      </w:r>
+      <w:proofErr w:type="spellStart"/>
+      <w:r>
+        <w:rPr>
+          <w:lang w:val="es-419"/>
+        </w:rPr>
+        <w:t>project</w:t>
+      </w:r>
+      <w:proofErr w:type="spellEnd"/>
+      <w:r>
+        <w:rPr>
+          <w:lang w:val="es-419"/>
+        </w:rPr>
+        <w:t xml:space="preserve"> status.</w:t>
+      </w:r>
+    </w:p>
+    <w:p>
+      <w:pPr>
+        <w:rPr>
+          <w:lang w:val="es-419"/>
+        </w:rPr>
+      </w:pPr>
+    </w:p>
+    <w:p>
+      <w:pPr>
+        <w:pStyle w:val="ListParagraph"/>
+        <w:numPr>
+          <w:ilvl w:val="0"/>
+          <w:numId w:val="2"/>
+        </w:numPr>
+        <w:rPr>
+          <w:lang w:val="es-419"/>
+        </w:rPr>
+      </w:pPr>
+      <w:r>
+        <w:rPr>
+          <w:lang w:val="es-419"/>
+        </w:rPr>
+        <w:t xml:space="preserve">Que el programa permita al usuario subir el Project status </w:t>
+      </w:r>
+      <w:proofErr w:type="spellStart"/>
+      <w:r>
+        <w:rPr>
+          <w:lang w:val="es-419"/>
+        </w:rPr>
+        <w:t>mas</w:t>
+      </w:r>
+      <w:proofErr w:type="spellEnd"/>
+      <w:r>
+        <w:rPr>
+          <w:lang w:val="es-419"/>
+        </w:rPr>
+        <w:t xml:space="preserve"> reciente en </w:t>
+      </w:r>
+      <w:proofErr w:type="spellStart"/>
+      <w:r>
+        <w:rPr>
+          <w:lang w:val="es-419"/>
+        </w:rPr>
+        <w:t>pdf</w:t>
+      </w:r>
+      <w:proofErr w:type="spellEnd"/>
+      <w:r>
+        <w:rPr>
+          <w:lang w:val="es-419"/>
+        </w:rPr>
+        <w:t>.</w:t>
+      </w:r>
+    </w:p>
+    <w:p>
+      <w:pPr>
+        <w:pStyle w:val="ListParagraph"/>
+        <w:numPr>
+          <w:ilvl w:val="0"/>
+          <w:numId w:val="2"/>
+        </w:numPr>
+        <w:rPr>
+          <w:lang w:val="es-419"/>
+        </w:rPr>
+      </w:pPr>
+      <w:r>
+        <w:rPr>
+          <w:lang w:val="es-419"/>
+        </w:rPr>
+        <w:t>Que siempre que se meta un Project status (PS) nuevo, que compare los valores:</w:t>
+      </w:r>
+    </w:p>
+    <w:p>
+      <w:pPr>
+        <w:pStyle w:val="ListParagraph"/>
+        <w:ind w:left="1440"/>
+        <w:rPr>
+          <w:lang w:val="es-419"/>
+        </w:rPr>
+      </w:pPr>
+      <w:r>
+        <w:rPr>
+          <w:lang w:val="es-419"/>
+        </w:rPr>
+        <w:t xml:space="preserve">Comparar </w:t>
+      </w:r>
+      <w:r>
+        <w:rPr>
+          <w:lang w:val="es-419"/>
+        </w:rPr>
+        <w:t>los siguientes valores:</w:t>
+      </w:r>
+    </w:p>
+    <w:p>
+      <w:pPr>
+        <w:pStyle w:val="ListParagraph"/>
+        <w:numPr>
+          <w:ilvl w:val="1"/>
+          <w:numId w:val="2"/>
+        </w:numPr>
+        <w:rPr>
+          <w:lang w:val="es-419"/>
+        </w:rPr>
+      </w:pPr>
+      <w:r>
+        <w:rPr>
+          <w:lang w:val="es-419"/>
+        </w:rPr>
+        <w:t>E</w:t>
+      </w:r>
+      <w:r>
+        <w:rPr>
+          <w:lang w:val="es-419"/>
+        </w:rPr>
+        <w:t xml:space="preserve">l </w:t>
+      </w:r>
+      <w:proofErr w:type="spellStart"/>
+      <w:r>
+        <w:rPr>
+          <w:lang w:val="es-419"/>
+        </w:rPr>
+        <w:t>amount</w:t>
+      </w:r>
+      <w:proofErr w:type="spellEnd"/>
+      <w:r>
+        <w:rPr>
+          <w:lang w:val="es-419"/>
+        </w:rPr>
+        <w:t xml:space="preserve"> original </w:t>
+      </w:r>
+      <w:r>
+        <w:rPr>
+          <w:lang w:val="es-419"/>
+        </w:rPr>
+        <w:t xml:space="preserve">que dice </w:t>
+      </w:r>
+      <w:r>
+        <w:rPr>
+          <w:lang w:val="es-419"/>
+        </w:rPr>
+        <w:t>el P</w:t>
+      </w:r>
+      <w:r>
+        <w:rPr>
+          <w:lang w:val="es-419"/>
+        </w:rPr>
+        <w:t>roject Status</w:t>
+      </w:r>
+      <w:r>
+        <w:rPr>
+          <w:lang w:val="es-419"/>
+        </w:rPr>
+        <w:t xml:space="preserve"> </w:t>
+      </w:r>
+      <w:r>
+        <w:rPr>
+          <w:lang w:val="es-419"/>
+        </w:rPr>
+        <w:t xml:space="preserve">con </w:t>
+      </w:r>
+      <w:r>
+        <w:rPr>
+          <w:lang w:val="es-419"/>
+        </w:rPr>
+        <w:t xml:space="preserve">la </w:t>
+      </w:r>
+      <w:r>
+        <w:rPr>
+          <w:lang w:val="es-419"/>
+        </w:rPr>
+        <w:t xml:space="preserve">suma de todos los </w:t>
+      </w:r>
+      <w:proofErr w:type="spellStart"/>
+      <w:r>
+        <w:rPr>
+          <w:lang w:val="es-419"/>
+        </w:rPr>
+        <w:t>amounts</w:t>
+      </w:r>
+      <w:proofErr w:type="spellEnd"/>
+      <w:r>
+        <w:rPr>
+          <w:lang w:val="es-419"/>
+        </w:rPr>
+        <w:t xml:space="preserve"> de las partidas que no tengan su origen en un EWO, ni en un CHO en el programa</w:t>
+      </w:r>
+      <w:r>
+        <w:rPr>
+          <w:lang w:val="es-419"/>
+        </w:rPr>
+        <w:t xml:space="preserve"> PACT</w:t>
+      </w:r>
+      <w:r>
+        <w:rPr>
+          <w:lang w:val="es-419"/>
+        </w:rPr>
+        <w:t>.</w:t>
+      </w:r>
+    </w:p>
+    <w:p>
+      <w:pPr>
+        <w:pStyle w:val="ListParagraph"/>
+        <w:numPr>
+          <w:ilvl w:val="1"/>
+          <w:numId w:val="2"/>
+        </w:numPr>
+        <w:rPr>
+          <w:lang w:val="es-419"/>
+        </w:rPr>
+      </w:pPr>
+      <w:r>
+        <w:rPr>
+          <w:lang w:val="es-419"/>
+        </w:rPr>
+        <w:t xml:space="preserve">El </w:t>
+      </w:r>
+      <w:proofErr w:type="spellStart"/>
+      <w:r>
+        <w:rPr>
+          <w:lang w:val="es-419"/>
+        </w:rPr>
+        <w:t>amount</w:t>
+      </w:r>
+      <w:proofErr w:type="spellEnd"/>
+      <w:r>
+        <w:rPr>
+          <w:lang w:val="es-419"/>
+        </w:rPr>
+        <w:t xml:space="preserve"> revisado que dice el Project Status con la suma de todos los </w:t>
+      </w:r>
+      <w:proofErr w:type="spellStart"/>
+      <w:r>
+        <w:rPr>
+          <w:lang w:val="es-419"/>
+        </w:rPr>
+        <w:t>amounts</w:t>
+      </w:r>
+      <w:proofErr w:type="spellEnd"/>
+      <w:r>
+        <w:rPr>
+          <w:lang w:val="es-419"/>
+        </w:rPr>
+        <w:t xml:space="preserve"> incluyendo las partidas que tienen su origen en un EWO, o en un CHO en el programa PACT.</w:t>
+      </w:r>
+    </w:p>
+    <w:p>
+      <w:pPr>
+        <w:pStyle w:val="ListParagraph"/>
+        <w:numPr>
+          <w:ilvl w:val="1"/>
+          <w:numId w:val="2"/>
+        </w:numPr>
+        <w:rPr>
+          <w:lang w:val="es-419"/>
+        </w:rPr>
+      </w:pPr>
+      <w:r>
+        <w:rPr>
+          <w:lang w:val="es-419"/>
+        </w:rPr>
+        <w:t xml:space="preserve">El </w:t>
+      </w:r>
+      <w:proofErr w:type="spellStart"/>
+      <w:r>
+        <w:rPr>
+          <w:lang w:val="es-419"/>
+        </w:rPr>
+        <w:t>amount</w:t>
+      </w:r>
+      <w:proofErr w:type="spellEnd"/>
+      <w:r>
+        <w:rPr>
+          <w:lang w:val="es-419"/>
+        </w:rPr>
+        <w:t xml:space="preserve"> certificado que dice el PS con la suma de todos los </w:t>
+      </w:r>
+      <w:proofErr w:type="spellStart"/>
+      <w:r>
+        <w:rPr>
+          <w:lang w:val="es-419"/>
+        </w:rPr>
+        <w:t>amounts</w:t>
+      </w:r>
+      <w:proofErr w:type="spellEnd"/>
+      <w:r>
+        <w:rPr>
+          <w:lang w:val="es-419"/>
+        </w:rPr>
+        <w:t xml:space="preserve"> certificados registrados en el programa PACT.</w:t>
+      </w:r>
+    </w:p>
+    <w:p>
+      <w:pPr>
+        <w:pStyle w:val="ListParagraph"/>
+        <w:numPr>
+          <w:ilvl w:val="1"/>
+          <w:numId w:val="2"/>
+        </w:numPr>
+        <w:rPr>
+          <w:lang w:val="es-419"/>
+        </w:rPr>
+      </w:pPr>
+      <w:r>
+        <w:rPr>
+          <w:lang w:val="es-419"/>
+        </w:rPr>
+        <w:t xml:space="preserve">El </w:t>
+      </w:r>
+      <w:proofErr w:type="spellStart"/>
+      <w:r>
+        <w:rPr>
+          <w:lang w:val="es-419"/>
+        </w:rPr>
+        <w:t>amount</w:t>
+      </w:r>
+      <w:proofErr w:type="spellEnd"/>
+      <w:r>
+        <w:rPr>
+          <w:lang w:val="es-419"/>
+        </w:rPr>
+        <w:t xml:space="preserve"> de la </w:t>
+      </w:r>
+      <w:proofErr w:type="spellStart"/>
+      <w:r>
+        <w:rPr>
+          <w:lang w:val="es-419"/>
+        </w:rPr>
+        <w:t>ultima</w:t>
+      </w:r>
+      <w:proofErr w:type="spellEnd"/>
+      <w:r>
+        <w:rPr>
+          <w:lang w:val="es-419"/>
+        </w:rPr>
+        <w:t xml:space="preserve"> certificación del Project status </w:t>
+      </w:r>
+      <w:r>
+        <w:rPr>
+          <w:lang w:val="es-419"/>
+        </w:rPr>
+        <w:t xml:space="preserve">con la cantidad que se ha pagado en la </w:t>
+      </w:r>
+      <w:proofErr w:type="spellStart"/>
+      <w:r>
+        <w:rPr>
+          <w:lang w:val="es-419"/>
+        </w:rPr>
+        <w:t>ultima</w:t>
+      </w:r>
+      <w:proofErr w:type="spellEnd"/>
+      <w:r>
+        <w:rPr>
+          <w:lang w:val="es-419"/>
+        </w:rPr>
+        <w:t xml:space="preserve"> certificación según el programa </w:t>
+      </w:r>
+      <w:proofErr w:type="spellStart"/>
+      <w:r>
+        <w:rPr>
+          <w:lang w:val="es-419"/>
+        </w:rPr>
+        <w:t>PACT</w:t>
+      </w:r>
+      <w:r>
+        <w:rPr>
+          <w:lang w:val="es-419"/>
+        </w:rPr>
+        <w:t>Compara</w:t>
+      </w:r>
+      <w:proofErr w:type="spellEnd"/>
+      <w:r>
+        <w:rPr>
+          <w:lang w:val="es-419"/>
+        </w:rPr>
+        <w:t xml:space="preserve"> el </w:t>
+      </w:r>
+      <w:proofErr w:type="spellStart"/>
+      <w:r>
+        <w:rPr>
+          <w:lang w:val="es-419"/>
+        </w:rPr>
+        <w:t>amount</w:t>
+      </w:r>
+      <w:proofErr w:type="spellEnd"/>
+      <w:r>
+        <w:rPr>
+          <w:lang w:val="es-419"/>
+        </w:rPr>
+        <w:t xml:space="preserve"> </w:t>
+      </w:r>
+      <w:proofErr w:type="spellStart"/>
+      <w:r>
+        <w:rPr>
+          <w:lang w:val="es-419"/>
+        </w:rPr>
+        <w:t>remaining</w:t>
+      </w:r>
+      <w:proofErr w:type="spellEnd"/>
+      <w:r>
+        <w:rPr>
+          <w:lang w:val="es-419"/>
+        </w:rPr>
+        <w:t xml:space="preserve"> del Project status con el </w:t>
+      </w:r>
+      <w:proofErr w:type="spellStart"/>
+      <w:r>
+        <w:rPr>
+          <w:lang w:val="es-419"/>
+        </w:rPr>
+        <w:t>remaining</w:t>
+      </w:r>
+      <w:proofErr w:type="spellEnd"/>
+      <w:r>
+        <w:rPr>
+          <w:lang w:val="es-419"/>
+        </w:rPr>
+        <w:t xml:space="preserve"> del programa PACT</w:t>
+      </w:r>
+    </w:p>
+    <w:p>
+      <w:pPr>
+        <w:pStyle w:val="ListParagraph"/>
+        <w:numPr>
+          <w:ilvl w:val="1"/>
+          <w:numId w:val="2"/>
+        </w:numPr>
+        <w:rPr>
+          <w:lang w:val="es-419"/>
+        </w:rPr>
+      </w:pPr>
+      <w:r>
+        <w:rPr>
+          <w:lang w:val="es-419"/>
+        </w:rPr>
+        <w:t xml:space="preserve">El </w:t>
+      </w:r>
+      <w:proofErr w:type="spellStart"/>
+      <w:r>
+        <w:rPr>
+          <w:lang w:val="es-419"/>
+        </w:rPr>
+        <w:t>amount</w:t>
+      </w:r>
+      <w:proofErr w:type="spellEnd"/>
+      <w:r>
+        <w:rPr>
+          <w:lang w:val="es-419"/>
+        </w:rPr>
+        <w:t xml:space="preserve"> neto pagado  del Project status, con el </w:t>
+      </w:r>
+      <w:proofErr w:type="spellStart"/>
+      <w:r>
+        <w:rPr>
+          <w:lang w:val="es-419"/>
+        </w:rPr>
+        <w:t>amount</w:t>
+      </w:r>
+      <w:proofErr w:type="spellEnd"/>
+      <w:r>
+        <w:rPr>
+          <w:lang w:val="es-419"/>
+        </w:rPr>
+        <w:t xml:space="preserve"> neto pagado según el programa PACT (eso es el </w:t>
+      </w:r>
+      <w:proofErr w:type="spellStart"/>
+      <w:r>
+        <w:rPr>
+          <w:lang w:val="es-419"/>
+        </w:rPr>
+        <w:t>amount</w:t>
+      </w:r>
+      <w:proofErr w:type="spellEnd"/>
+      <w:r>
+        <w:rPr>
+          <w:lang w:val="es-419"/>
+        </w:rPr>
+        <w:t xml:space="preserve"> certificado menos el 5% retenido).</w:t>
+      </w:r>
+    </w:p>
+    <w:p>
+      <w:pPr>
+        <w:pStyle w:val="ListParagraph"/>
+        <w:numPr>
+          <w:ilvl w:val="1"/>
+          <w:numId w:val="2"/>
+        </w:numPr>
+        <w:rPr>
+          <w:lang w:val="es-419"/>
+        </w:rPr>
+      </w:pPr>
+      <w:r>
+        <w:rPr>
+          <w:lang w:val="es-419"/>
+        </w:rPr>
+        <w:t xml:space="preserve">El </w:t>
+      </w:r>
+      <w:proofErr w:type="spellStart"/>
+      <w:r>
+        <w:rPr>
+          <w:lang w:val="es-419"/>
+        </w:rPr>
+        <w:t>amount</w:t>
+      </w:r>
+      <w:proofErr w:type="spellEnd"/>
+      <w:r>
+        <w:rPr>
+          <w:lang w:val="es-419"/>
+        </w:rPr>
+        <w:t xml:space="preserve"> de la </w:t>
+      </w:r>
+      <w:proofErr w:type="spellStart"/>
+      <w:r>
+        <w:rPr>
+          <w:lang w:val="es-419"/>
+        </w:rPr>
+        <w:t>ultima</w:t>
+      </w:r>
+      <w:proofErr w:type="spellEnd"/>
+      <w:r>
+        <w:rPr>
+          <w:lang w:val="es-419"/>
+        </w:rPr>
+        <w:t xml:space="preserve"> retención del Project status vs el </w:t>
+      </w:r>
+      <w:proofErr w:type="spellStart"/>
+      <w:r>
+        <w:rPr>
+          <w:lang w:val="es-419"/>
+        </w:rPr>
+        <w:t>amount</w:t>
+      </w:r>
+      <w:proofErr w:type="spellEnd"/>
+      <w:r>
+        <w:rPr>
+          <w:lang w:val="es-419"/>
+        </w:rPr>
+        <w:t xml:space="preserve"> de la </w:t>
+      </w:r>
+      <w:proofErr w:type="spellStart"/>
+      <w:r>
+        <w:rPr>
+          <w:lang w:val="es-419"/>
+        </w:rPr>
+        <w:t>ultima</w:t>
+      </w:r>
+      <w:proofErr w:type="spellEnd"/>
+      <w:r>
+        <w:rPr>
+          <w:lang w:val="es-419"/>
+        </w:rPr>
+        <w:t xml:space="preserve"> retención en el programa PACT</w:t>
+      </w:r>
+    </w:p>
+    <w:p>
+      <w:pPr>
+        <w:pStyle w:val="ListParagraph"/>
+        <w:numPr>
+          <w:ilvl w:val="1"/>
+          <w:numId w:val="2"/>
+        </w:numPr>
+        <w:rPr>
+          <w:lang w:val="es-419"/>
+        </w:rPr>
+      </w:pPr>
+      <w:r>
+        <w:rPr>
+          <w:lang w:val="es-419"/>
+        </w:rPr>
+        <w:t xml:space="preserve">El total de retenido en el Project Status (aparece como </w:t>
+      </w:r>
+      <w:proofErr w:type="spellStart"/>
+      <w:r>
+        <w:rPr>
+          <w:lang w:val="es-419"/>
+        </w:rPr>
+        <w:t>Retention</w:t>
+      </w:r>
+      <w:proofErr w:type="spellEnd"/>
+      <w:r>
+        <w:rPr>
+          <w:lang w:val="es-419"/>
+        </w:rPr>
+        <w:t xml:space="preserve"> TD) con el total del retenido en el proyecto que dice el programa PACT.</w:t>
+      </w:r>
+    </w:p>
+    <w:p>
+      <w:pPr>
+        <w:pStyle w:val="ListParagraph"/>
+        <w:numPr>
+          <w:ilvl w:val="1"/>
+          <w:numId w:val="2"/>
+        </w:numPr>
+        <w:rPr>
+          <w:lang w:val="es-419"/>
+        </w:rPr>
+      </w:pPr>
+      <w:r>
+        <w:rPr>
+          <w:lang w:val="es-419"/>
+        </w:rPr>
+        <w:t xml:space="preserve">Los balances de cantidades certificadas, </w:t>
+      </w:r>
+      <w:proofErr w:type="spellStart"/>
+      <w:r>
+        <w:rPr>
+          <w:lang w:val="es-419"/>
+        </w:rPr>
+        <w:t>amount</w:t>
+      </w:r>
+      <w:proofErr w:type="spellEnd"/>
+      <w:r>
+        <w:rPr>
+          <w:lang w:val="es-419"/>
+        </w:rPr>
+        <w:t xml:space="preserve"> certificado, cantidad </w:t>
+      </w:r>
+      <w:proofErr w:type="spellStart"/>
+      <w:r>
+        <w:rPr>
+          <w:lang w:val="es-419"/>
+        </w:rPr>
+        <w:t>remaining</w:t>
+      </w:r>
+      <w:proofErr w:type="spellEnd"/>
+      <w:r>
+        <w:rPr>
+          <w:lang w:val="es-419"/>
+        </w:rPr>
+        <w:t xml:space="preserve"> y </w:t>
+      </w:r>
+      <w:proofErr w:type="spellStart"/>
+      <w:r>
+        <w:rPr>
+          <w:lang w:val="es-419"/>
+        </w:rPr>
+        <w:t>amount</w:t>
+      </w:r>
+      <w:proofErr w:type="spellEnd"/>
+      <w:r>
+        <w:rPr>
+          <w:lang w:val="es-419"/>
+        </w:rPr>
+        <w:t xml:space="preserve"> </w:t>
+      </w:r>
+      <w:proofErr w:type="spellStart"/>
+      <w:r>
+        <w:rPr>
+          <w:lang w:val="es-419"/>
+        </w:rPr>
+        <w:t>remaining</w:t>
+      </w:r>
+      <w:proofErr w:type="spellEnd"/>
+      <w:r>
+        <w:rPr>
+          <w:lang w:val="es-419"/>
+        </w:rPr>
+        <w:t xml:space="preserve"> de cada partida según el Project Status con los respectivos balances de cada partida según el programa PACT.</w:t>
+      </w:r>
+    </w:p>
+    <w:p>
+      <w:pPr>
+        <w:pStyle w:val="ListParagraph"/>
+        <w:numPr>
+          <w:ilvl w:val="1"/>
+          <w:numId w:val="2"/>
+        </w:numPr>
+        <w:rPr>
+          <w:lang w:val="es-419"/>
+        </w:rPr>
+      </w:pPr>
+      <w:r>
+        <w:rPr>
+          <w:lang w:val="es-419"/>
+        </w:rPr>
+        <w:t xml:space="preserve">Los balances de los ítems del Project status de cada CHO y/o EWO con los datos del programa ACT </w:t>
+      </w:r>
+    </w:p>
+    <w:p>
+      <w:pPr>
+        <w:rPr>
+          <w:lang w:val="es-419"/>
+        </w:rPr>
+      </w:pPr>
+    </w:p>
+    <w:p>
+      <w:pPr>
+        <w:rPr>
+          <w:lang w:val="es-419"/>
+        </w:rPr>
+      </w:pPr>
+      <w:r>
+        <w:rPr>
+          <w:lang w:val="es-419"/>
+        </w:rPr>
+        <w:t xml:space="preserve">Que se haga un reporte en Excel con los valores que se están comparando, y en otra columna que diga si son iguales o no las cantidades comparadas, y si hay diferencia, que en otra columna diga cual es la cantidad por la que difieren. Y que </w:t>
+      </w:r>
+      <w:r>
+        <w:rPr>
+          <w:lang w:val="es-419"/>
+        </w:rPr>
+        <w:t>la línea que tenga un desbalance, se pinte de color rojo.</w:t>
+      </w:r>
+    </w:p>
+    <w:p>
+      <w:pPr>
+        <w:pBdr>
+          <w:bottom w:val="single" w:sz="12" w:space="1" w:color="auto"/>
+        </w:pBdr>
+        <w:rPr>
+          <w:lang w:val="es-419"/>
+        </w:rPr>
+      </w:pPr>
+    </w:p>
+    <w:p>
+      <w:pPr>
+        <w:rPr>
+          <w:lang w:val="es-419"/>
+        </w:rPr>
+      </w:pPr>
+      <w:r>
+        <w:rPr>
+          <w:lang w:val="es-419"/>
+        </w:rPr>
+        <w:lastRenderedPageBreak/>
+        <w:t xml:space="preserve">Este es el </w:t>
+      </w:r>
+      <w:proofErr w:type="spellStart"/>
+      <w:r>
+        <w:rPr>
+          <w:lang w:val="es-419"/>
+        </w:rPr>
+        <w:t>prompt</w:t>
+      </w:r>
+      <w:proofErr w:type="spellEnd"/>
+      <w:r>
+        <w:rPr>
+          <w:lang w:val="es-419"/>
+        </w:rPr>
+        <w:t xml:space="preserve"> creado por </w:t>
+      </w:r>
+      <w:proofErr w:type="spellStart"/>
+      <w:r>
+        <w:rPr>
+          <w:lang w:val="es-419"/>
+        </w:rPr>
+        <w:t>copilot</w:t>
+      </w:r>
+      <w:proofErr w:type="spellEnd"/>
+      <w:r>
+        <w:rPr>
+          <w:lang w:val="es-419"/>
+        </w:rPr>
+        <w:t>:</w:t>
+      </w:r>
+    </w:p>
+    <w:p>
+      <w:pPr>
+        <w:rPr>
+          <w:lang w:val="es-419"/>
+        </w:rPr>
+      </w:pPr>
+    </w:p>
+    <w:p>
+      <w:pPr>
+        <w:rPr>
+          <w:lang w:val="es-419"/>
+        </w:rPr>
+      </w:pPr>
+      <w:r>
+        <w:rPr>
+          <w:lang w:val="es-419"/>
+        </w:rPr>
+        <w:t xml:space="preserve">Crear una nueva sección en el sistema llamada: "Comparación con Project Status". Objetivo: Permitir comparar automáticamente los datos del programa PACT contra el Project Status (PS) más reciente. Funcionalidades: 1. Carga de archivo: - El programa debe permitir al usuario subir el Project Status más reciente en formato PDF. - El sistema debe poder leer y extraer los valores relevantes del PDF. 2. Comparación automática: Cada vez que se cargue un nuevo Project Status (PS), el sistema debe realizar automáticamente las siguientes comparaciones: a. </w:t>
+      </w:r>
+      <w:proofErr w:type="spellStart"/>
+      <w:r>
+        <w:rPr>
+          <w:lang w:val="es-419"/>
+        </w:rPr>
+        <w:t>Amount</w:t>
+      </w:r>
+      <w:proofErr w:type="spellEnd"/>
+      <w:r>
+        <w:rPr>
+          <w:lang w:val="es-419"/>
+        </w:rPr>
+        <w:t xml:space="preserve"> Original: - Comparar el </w:t>
+      </w:r>
+      <w:proofErr w:type="spellStart"/>
+      <w:r>
+        <w:rPr>
+          <w:lang w:val="es-419"/>
+        </w:rPr>
+        <w:t>amount</w:t>
+      </w:r>
+      <w:proofErr w:type="spellEnd"/>
+      <w:r>
+        <w:rPr>
+          <w:lang w:val="es-419"/>
+        </w:rPr>
+        <w:t xml:space="preserve"> original del PS - vs la suma de todos los </w:t>
+      </w:r>
+      <w:proofErr w:type="spellStart"/>
+      <w:r>
+        <w:rPr>
+          <w:lang w:val="es-419"/>
+        </w:rPr>
+        <w:t>amounts</w:t>
+      </w:r>
+      <w:proofErr w:type="spellEnd"/>
+      <w:r>
+        <w:rPr>
+          <w:lang w:val="es-419"/>
+        </w:rPr>
+        <w:t xml:space="preserve"> de partidas en PACT que NO provienen de EWO ni CHO. b. </w:t>
+      </w:r>
+      <w:proofErr w:type="spellStart"/>
+      <w:r>
+        <w:rPr>
+          <w:lang w:val="es-419"/>
+        </w:rPr>
+        <w:t>Amount</w:t>
+      </w:r>
+      <w:proofErr w:type="spellEnd"/>
+      <w:r>
+        <w:rPr>
+          <w:lang w:val="es-419"/>
+        </w:rPr>
+        <w:t xml:space="preserve"> Revisado: - Comparar el </w:t>
+      </w:r>
+      <w:proofErr w:type="spellStart"/>
+      <w:r>
+        <w:rPr>
+          <w:lang w:val="es-419"/>
+        </w:rPr>
+        <w:t>amount</w:t>
+      </w:r>
+      <w:proofErr w:type="spellEnd"/>
+      <w:r>
+        <w:rPr>
+          <w:lang w:val="es-419"/>
+        </w:rPr>
+        <w:t xml:space="preserve"> revisado del PS - vs la suma de todos los </w:t>
+      </w:r>
+      <w:proofErr w:type="spellStart"/>
+      <w:r>
+        <w:rPr>
+          <w:lang w:val="es-419"/>
+        </w:rPr>
+        <w:t>amounts</w:t>
+      </w:r>
+      <w:proofErr w:type="spellEnd"/>
+      <w:r>
+        <w:rPr>
+          <w:lang w:val="es-419"/>
+        </w:rPr>
+        <w:t xml:space="preserve"> en PACT incluyendo partidas provenientes de EWO y CHO. c. </w:t>
+      </w:r>
+      <w:proofErr w:type="spellStart"/>
+      <w:r>
+        <w:rPr>
+          <w:lang w:val="es-419"/>
+        </w:rPr>
+        <w:t>Amount</w:t>
+      </w:r>
+      <w:proofErr w:type="spellEnd"/>
+      <w:r>
+        <w:rPr>
+          <w:lang w:val="es-419"/>
+        </w:rPr>
+        <w:t xml:space="preserve"> Certificado: - Comparar el </w:t>
+      </w:r>
+      <w:proofErr w:type="spellStart"/>
+      <w:r>
+        <w:rPr>
+          <w:lang w:val="es-419"/>
+        </w:rPr>
+        <w:t>amount</w:t>
+      </w:r>
+      <w:proofErr w:type="spellEnd"/>
+      <w:r>
+        <w:rPr>
+          <w:lang w:val="es-419"/>
+        </w:rPr>
+        <w:t xml:space="preserve"> certificado del PS - vs la suma de todos los </w:t>
+      </w:r>
+      <w:proofErr w:type="spellStart"/>
+      <w:r>
+        <w:rPr>
+          <w:lang w:val="es-419"/>
+        </w:rPr>
+        <w:t>amounts</w:t>
+      </w:r>
+      <w:proofErr w:type="spellEnd"/>
+      <w:r>
+        <w:rPr>
+          <w:lang w:val="es-419"/>
+        </w:rPr>
+        <w:t xml:space="preserve"> certificados registrados en PACT. d. Última Certificación: - Comparar el </w:t>
+      </w:r>
+      <w:proofErr w:type="spellStart"/>
+      <w:r>
+        <w:rPr>
+          <w:lang w:val="es-419"/>
+        </w:rPr>
+        <w:t>amount</w:t>
+      </w:r>
+      <w:proofErr w:type="spellEnd"/>
+      <w:r>
+        <w:rPr>
+          <w:lang w:val="es-419"/>
+        </w:rPr>
+        <w:t xml:space="preserve"> de la última certificación del PS - vs el </w:t>
+      </w:r>
+      <w:proofErr w:type="spellStart"/>
+      <w:r>
+        <w:rPr>
+          <w:lang w:val="es-419"/>
+        </w:rPr>
+        <w:t>amount</w:t>
+      </w:r>
+      <w:proofErr w:type="spellEnd"/>
+      <w:r>
+        <w:rPr>
+          <w:lang w:val="es-419"/>
+        </w:rPr>
+        <w:t xml:space="preserve"> pagado en la última certificación en PACT. e. </w:t>
+      </w:r>
+      <w:proofErr w:type="spellStart"/>
+      <w:r>
+        <w:rPr>
+          <w:lang w:val="es-419"/>
+        </w:rPr>
+        <w:t>Amount</w:t>
+      </w:r>
+      <w:proofErr w:type="spellEnd"/>
+      <w:r>
+        <w:rPr>
+          <w:lang w:val="es-419"/>
+        </w:rPr>
+        <w:t xml:space="preserve"> </w:t>
+      </w:r>
+      <w:proofErr w:type="spellStart"/>
+      <w:r>
+        <w:rPr>
+          <w:lang w:val="es-419"/>
+        </w:rPr>
+        <w:t>Remaining</w:t>
+      </w:r>
+      <w:proofErr w:type="spellEnd"/>
+      <w:r>
+        <w:rPr>
+          <w:lang w:val="es-419"/>
+        </w:rPr>
+        <w:t xml:space="preserve">: - Comparar el </w:t>
+      </w:r>
+      <w:proofErr w:type="spellStart"/>
+      <w:r>
+        <w:rPr>
+          <w:lang w:val="es-419"/>
+        </w:rPr>
+        <w:t>amount</w:t>
+      </w:r>
+      <w:proofErr w:type="spellEnd"/>
+      <w:r>
+        <w:rPr>
+          <w:lang w:val="es-419"/>
+        </w:rPr>
+        <w:t xml:space="preserve"> </w:t>
+      </w:r>
+      <w:proofErr w:type="spellStart"/>
+      <w:r>
+        <w:rPr>
+          <w:lang w:val="es-419"/>
+        </w:rPr>
+        <w:t>remaining</w:t>
+      </w:r>
+      <w:proofErr w:type="spellEnd"/>
+      <w:r>
+        <w:rPr>
+          <w:lang w:val="es-419"/>
+        </w:rPr>
+        <w:t xml:space="preserve"> del PS - vs el </w:t>
+      </w:r>
+      <w:proofErr w:type="spellStart"/>
+      <w:r>
+        <w:rPr>
+          <w:lang w:val="es-419"/>
+        </w:rPr>
+        <w:t>remaining</w:t>
+      </w:r>
+      <w:proofErr w:type="spellEnd"/>
+      <w:r>
+        <w:rPr>
+          <w:lang w:val="es-419"/>
+        </w:rPr>
+        <w:t xml:space="preserve"> total en PACT. f. </w:t>
+      </w:r>
+      <w:proofErr w:type="spellStart"/>
+      <w:r>
+        <w:rPr>
+          <w:lang w:val="es-419"/>
+        </w:rPr>
+        <w:t>Amount</w:t>
+      </w:r>
+      <w:proofErr w:type="spellEnd"/>
+      <w:r>
+        <w:rPr>
+          <w:lang w:val="es-419"/>
+        </w:rPr>
+        <w:t xml:space="preserve"> Neto Pagado: - Comparar el </w:t>
+      </w:r>
+      <w:proofErr w:type="spellStart"/>
+      <w:r>
+        <w:rPr>
+          <w:lang w:val="es-419"/>
+        </w:rPr>
+        <w:t>amount</w:t>
+      </w:r>
+      <w:proofErr w:type="spellEnd"/>
+      <w:r>
+        <w:rPr>
+          <w:lang w:val="es-419"/>
+        </w:rPr>
+        <w:t xml:space="preserve"> neto pagado del PS - vs el </w:t>
+      </w:r>
+      <w:proofErr w:type="spellStart"/>
+      <w:r>
+        <w:rPr>
+          <w:lang w:val="es-419"/>
+        </w:rPr>
+        <w:t>amount</w:t>
+      </w:r>
+      <w:proofErr w:type="spellEnd"/>
+      <w:r>
+        <w:rPr>
+          <w:lang w:val="es-419"/>
+        </w:rPr>
+        <w:t xml:space="preserve"> neto pagado en PACT (</w:t>
+      </w:r>
+      <w:proofErr w:type="spellStart"/>
+      <w:r>
+        <w:rPr>
+          <w:lang w:val="es-419"/>
+        </w:rPr>
+        <w:t>amount</w:t>
+      </w:r>
+      <w:proofErr w:type="spellEnd"/>
+      <w:r>
+        <w:rPr>
+          <w:lang w:val="es-419"/>
+        </w:rPr>
+        <w:t xml:space="preserve"> certificado menos 5% de retención). g. Última Retención: - Comparar el </w:t>
+      </w:r>
+      <w:proofErr w:type="spellStart"/>
+      <w:r>
+        <w:rPr>
+          <w:lang w:val="es-419"/>
+        </w:rPr>
+        <w:t>amount</w:t>
+      </w:r>
+      <w:proofErr w:type="spellEnd"/>
+      <w:r>
+        <w:rPr>
+          <w:lang w:val="es-419"/>
+        </w:rPr>
+        <w:t xml:space="preserve"> de la última retención del PS - vs el </w:t>
+      </w:r>
+      <w:proofErr w:type="spellStart"/>
+      <w:r>
+        <w:rPr>
+          <w:lang w:val="es-419"/>
+        </w:rPr>
+        <w:t>amount</w:t>
+      </w:r>
+      <w:proofErr w:type="spellEnd"/>
+      <w:r>
+        <w:rPr>
+          <w:lang w:val="es-419"/>
+        </w:rPr>
+        <w:t xml:space="preserve"> de la última retención en PACT. h. Retención Total: - Comparar el </w:t>
+      </w:r>
+      <w:proofErr w:type="spellStart"/>
+      <w:r>
+        <w:rPr>
+          <w:lang w:val="es-419"/>
+        </w:rPr>
+        <w:t>Retention</w:t>
+      </w:r>
+      <w:proofErr w:type="spellEnd"/>
+      <w:r>
+        <w:rPr>
+          <w:lang w:val="es-419"/>
+        </w:rPr>
+        <w:t xml:space="preserve"> TD del PS - vs el total retenido en el proyecto en PACT. i. Comparación por Partidas: Para cada partida: - Cantidades certificadas - </w:t>
+      </w:r>
+      <w:proofErr w:type="spellStart"/>
+      <w:r>
+        <w:rPr>
+          <w:lang w:val="es-419"/>
+        </w:rPr>
+        <w:t>Amount</w:t>
+      </w:r>
+      <w:proofErr w:type="spellEnd"/>
+      <w:r>
+        <w:rPr>
+          <w:lang w:val="es-419"/>
+        </w:rPr>
+        <w:t xml:space="preserve"> certificado - Cantidad </w:t>
+      </w:r>
+      <w:proofErr w:type="spellStart"/>
+      <w:r>
+        <w:rPr>
+          <w:lang w:val="es-419"/>
+        </w:rPr>
+        <w:t>remaining</w:t>
+      </w:r>
+      <w:proofErr w:type="spellEnd"/>
+      <w:r>
+        <w:rPr>
+          <w:lang w:val="es-419"/>
+        </w:rPr>
+        <w:t xml:space="preserve"> - </w:t>
+      </w:r>
+      <w:proofErr w:type="spellStart"/>
+      <w:r>
+        <w:rPr>
+          <w:lang w:val="es-419"/>
+        </w:rPr>
+        <w:t>Amount</w:t>
+      </w:r>
+      <w:proofErr w:type="spellEnd"/>
+      <w:r>
+        <w:rPr>
+          <w:lang w:val="es-419"/>
+        </w:rPr>
+        <w:t xml:space="preserve"> </w:t>
+      </w:r>
+      <w:proofErr w:type="spellStart"/>
+      <w:r>
+        <w:rPr>
+          <w:lang w:val="es-419"/>
+        </w:rPr>
+        <w:t>remaining</w:t>
+      </w:r>
+      <w:proofErr w:type="spellEnd"/>
+      <w:r>
+        <w:rPr>
+          <w:lang w:val="es-419"/>
+        </w:rPr>
+        <w:t xml:space="preserve"> Comparar los valores del PS vs los valores correspondientes en PACT. 3. Reporte en Excel: Generar automáticamente un archivo Excel que incluya: Columnas: - Nombre de la métrica o partida - Valor según Project Status - Valor según PACT - Resultado (Igual / Diferente) - Diferencia numérica Reglas: - Si los valores son iguales → marcar como "Igual" - Si hay diferencia → marcar como "Diferente" y mostrar la diferencia exacta - Resaltar en color rojo todas las filas donde exista diferencia Extras: - El archivo debe estar estructurado de forma clara y fácil de auditar - Incluir totales cuando aplique - Asegurar consistencia en formatos numéricos Resultado esperado: Una herramienta automática que permita validar el Project Status contra PACT de forma rápida, visual y auditable mediante Excel.</w:t>
+      </w:r>
+    </w:p>
+    <w:p>
+      <w:pPr>
+        <w:rPr>
+          <w:lang w:val="es-419"/>
+        </w:rPr>
+      </w:pPr>
+    </w:p>
+    <w:p>
+      <w:pPr>
+        <w:rPr>
+          <w:lang w:val="es-419"/>
+        </w:rPr>
+      </w:pPr>
+      <w:r>
+        <w:rPr>
+          <w:lang w:val="es-419"/>
+        </w:rPr>
+        <w:br w:type="page"/>
+      </w:r>
+    </w:p>
+    <w:p>
+      <w:pPr>
+        <w:rPr>
+          <w:lang w:val="es-419"/>
+        </w:rPr>
+      </w:pPr>
+      <w:r>
+        <w:rPr>
+          <w:lang w:val="es-419"/>
+        </w:rPr>
+        <w:lastRenderedPageBreak/>
+        <w:t xml:space="preserve">Estos cambios, no quiero que los hagas en la </w:t>
+      </w:r>
+      <w:proofErr w:type="spellStart"/>
+      <w:r>
+        <w:rPr>
+          <w:lang w:val="es-419"/>
+        </w:rPr>
+        <w:t>seccion</w:t>
+      </w:r>
+      <w:proofErr w:type="spellEnd"/>
+      <w:r>
+        <w:rPr>
+          <w:lang w:val="es-419"/>
+        </w:rPr>
+        <w:t xml:space="preserve"> que se llama "Todas las partidas", </w:t>
+      </w:r>
+      <w:proofErr w:type="spellStart"/>
+      <w:r>
+        <w:rPr>
+          <w:lang w:val="es-419"/>
+        </w:rPr>
+        <w:t>unicamente</w:t>
+      </w:r>
+      <w:proofErr w:type="spellEnd"/>
+      <w:r>
+        <w:rPr>
+          <w:lang w:val="es-419"/>
+        </w:rPr>
+        <w:t xml:space="preserve"> </w:t>
+      </w:r>
+      <w:proofErr w:type="spellStart"/>
+      <w:r>
+        <w:rPr>
+          <w:lang w:val="es-419"/>
+        </w:rPr>
+        <w:t>queria</w:t>
+      </w:r>
+      <w:proofErr w:type="spellEnd"/>
+      <w:r>
+        <w:rPr>
+          <w:lang w:val="es-419"/>
+        </w:rPr>
+        <w:t xml:space="preserve"> que lo realizaras a la </w:t>
+      </w:r>
+      <w:proofErr w:type="spellStart"/>
+      <w:r>
+        <w:rPr>
+          <w:lang w:val="es-419"/>
+        </w:rPr>
+        <w:t>seccion</w:t>
+      </w:r>
+      <w:proofErr w:type="spellEnd"/>
+      <w:r>
+        <w:rPr>
+          <w:lang w:val="es-419"/>
+        </w:rPr>
+        <w:t xml:space="preserve"> de entrada de datos en partidas, antes de hacer nada, dime lo que entiendes por lo que te digo</w:t>
       </w:r>
     </w:p>
     <w:p>
@@ -66,7 +1328,21 @@
         <w:rPr>
           <w:lang w:val="es-419"/>
         </w:rPr>
-        <w:t>Esto implica realizar los siguientes cambios en esta pantalla (ItemsForm.tsx):</w:t>
+        <w:t>Esto implica realizar los siguientes cambios en esta pantalla (</w:t>
+      </w:r>
+      <w:proofErr w:type="spellStart"/>
+      <w:r>
+        <w:rPr>
+          <w:lang w:val="es-419"/>
+        </w:rPr>
+        <w:t>ItemsForm.tsx</w:t>
+      </w:r>
+      <w:proofErr w:type="spellEnd"/>
+      <w:r>
+        <w:rPr>
+          <w:lang w:val="es-419"/>
+        </w:rPr>
+        <w:t>):</w:t>
       </w:r>
     </w:p>
     <w:p>
@@ -116,7 +1392,21 @@
         <w:rPr>
           <w:lang w:val="es-419"/>
         </w:rPr>
-        <w:t>: Dado que esta columna sumaba la cantidad original y la de CHO, al no tener CHOs aquí, esta columna deja de tener sentido en esta vista.</w:t>
+        <w:t xml:space="preserve">: Dado que esta columna sumaba la cantidad original y la de CHO, al no tener </w:t>
+      </w:r>
+      <w:proofErr w:type="spellStart"/>
+      <w:r>
+        <w:rPr>
+          <w:lang w:val="es-419"/>
+        </w:rPr>
+        <w:t>CHOs</w:t>
+      </w:r>
+      <w:proofErr w:type="spellEnd"/>
+      <w:r>
+        <w:rPr>
+          <w:lang w:val="es-419"/>
+        </w:rPr>
+        <w:t xml:space="preserve"> aquí, esta columna deja de tener sentido en esta vista.</w:t>
       </w:r>
     </w:p>
     <w:p>
@@ -141,7 +1431,21 @@
         <w:rPr>
           <w:lang w:val="es-419"/>
         </w:rPr>
-        <w:t>: La columna actual "Amount Final (</w:t>
+        <w:t>: La columna actual "</w:t>
+      </w:r>
+      <w:proofErr w:type="spellStart"/>
+      <w:r>
+        <w:rPr>
+          <w:lang w:val="es-419"/>
+        </w:rPr>
+        <w:t>Amount</w:t>
+      </w:r>
+      <w:proofErr w:type="spellEnd"/>
+      <w:r>
+        <w:rPr>
+          <w:lang w:val="es-419"/>
+        </w:rPr>
+        <w:t xml:space="preserve"> Final (</w:t>
       </w:r>
       <m:oMath>
         <m:r>
@@ -426,8 +1730,18 @@
           <w:bCs/>
           <w:lang w:val="es-419"/>
         </w:rPr>
-        <w:t>Remover toda la información de Certificaciones (Pagos) y CHOs</w:t>
-      </w:r>
+        <w:t xml:space="preserve">Remover toda la información de Certificaciones (Pagos) y </w:t>
+      </w:r>
+      <w:proofErr w:type="spellStart"/>
+      <w:r>
+        <w:rPr>
+          <w:b/>
+          <w:bCs/>
+          <w:lang w:val="es-419"/>
+        </w:rPr>
+        <w:t>CHOs</w:t>
+      </w:r>
+      <w:proofErr w:type="spellEnd"/>
       <w:r>
         <w:rPr>
           <w:lang w:val="es-419"/>
@@ -520,157 +1834,6 @@
         </w:rPr>
         <w:br w:type="page"/>
       </w:r>
-    </w:p>
-    <w:p>
-      <w:pPr>
-        <w:rPr>
-          <w:lang w:val="es-419"/>
-        </w:rPr>
-      </w:pPr>
-      <w:r>
-        <w:rPr>
-          <w:lang w:val="es-419"/>
-        </w:rPr>
-        <w:lastRenderedPageBreak/>
-        <w:t xml:space="preserve">Hacer una </w:t>
-      </w:r>
-      <w:r>
-        <w:rPr>
-          <w:lang w:val="es-419"/>
-        </w:rPr>
-        <w:t>sección</w:t>
-      </w:r>
-      <w:r>
-        <w:rPr>
-          <w:lang w:val="es-419"/>
-        </w:rPr>
-        <w:t xml:space="preserve"> para </w:t>
-      </w:r>
-      <w:r>
-        <w:rPr>
-          <w:lang w:val="es-419"/>
-        </w:rPr>
-        <w:t>comparar</w:t>
-      </w:r>
-      <w:r>
-        <w:rPr>
-          <w:lang w:val="es-419"/>
-        </w:rPr>
-        <w:t xml:space="preserve"> l</w:t>
-      </w:r>
-      <w:r>
-        <w:rPr>
-          <w:lang w:val="es-419"/>
-        </w:rPr>
-        <w:t>os resultados del programa con el project status.</w:t>
-      </w:r>
-    </w:p>
-    <w:p>
-      <w:pPr>
-        <w:rPr>
-          <w:lang w:val="es-419"/>
-        </w:rPr>
-      </w:pPr>
-    </w:p>
-    <w:p>
-      <w:pPr>
-        <w:pStyle w:val="ListParagraph"/>
-        <w:numPr>
-          <w:ilvl w:val="0"/>
-          <w:numId w:val="2"/>
-        </w:numPr>
-        <w:rPr>
-          <w:lang w:val="es-419"/>
-        </w:rPr>
-      </w:pPr>
-      <w:r>
-        <w:rPr>
-          <w:lang w:val="es-419"/>
-        </w:rPr>
-        <w:t>Que el programa permita subir un documento en pdf, que sea el Project status mas reciente</w:t>
-      </w:r>
-    </w:p>
-    <w:p>
-      <w:pPr>
-        <w:pStyle w:val="ListParagraph"/>
-        <w:numPr>
-          <w:ilvl w:val="0"/>
-          <w:numId w:val="2"/>
-        </w:numPr>
-        <w:rPr>
-          <w:lang w:val="es-419"/>
-        </w:rPr>
-      </w:pPr>
-      <w:r>
-        <w:rPr>
-          <w:lang w:val="es-419"/>
-        </w:rPr>
-        <w:t>Que siempre que se meta un Project status (PS) nuevo, que compare los valores:</w:t>
-      </w:r>
-    </w:p>
-    <w:p>
-      <w:pPr>
-        <w:pStyle w:val="ListParagraph"/>
-        <w:ind w:left="1440"/>
-        <w:rPr>
-          <w:lang w:val="es-419"/>
-        </w:rPr>
-      </w:pPr>
-      <w:r>
-        <w:rPr>
-          <w:lang w:val="es-419"/>
-        </w:rPr>
-        <w:t xml:space="preserve">Comparar </w:t>
-      </w:r>
-      <w:r>
-        <w:rPr>
-          <w:lang w:val="es-419"/>
-        </w:rPr>
-        <w:t>los siguientes valores:</w:t>
-      </w:r>
-    </w:p>
-    <w:p>
-      <w:pPr>
-        <w:pStyle w:val="ListParagraph"/>
-        <w:numPr>
-          <w:ilvl w:val="1"/>
-          <w:numId w:val="2"/>
-        </w:numPr>
-        <w:rPr>
-          <w:lang w:val="es-419"/>
-        </w:rPr>
-      </w:pPr>
-      <w:r>
-        <w:rPr>
-          <w:lang w:val="es-419"/>
-        </w:rPr>
-        <w:t>Costo original del PS que sea igual a la suma de todos los amounts de las partidas que no tengan su origen en un EWO, ni en un CHO</w:t>
-      </w:r>
-      <w:r>
-        <w:rPr>
-          <w:lang w:val="es-419"/>
-        </w:rPr>
-        <w:t xml:space="preserve"> en el programa</w:t>
-      </w:r>
-    </w:p>
-    <w:p>
-      <w:pPr>
-        <w:pStyle w:val="ListParagraph"/>
-        <w:numPr>
-          <w:ilvl w:val="1"/>
-          <w:numId w:val="2"/>
-        </w:numPr>
-        <w:rPr>
-          <w:lang w:val="es-419"/>
-        </w:rPr>
-      </w:pPr>
-    </w:p>
-    <w:p>
-      <w:pPr>
-        <w:rPr>
-          <w:lang w:val="es-419"/>
-        </w:rPr>
-      </w:pPr>
     </w:p>
     <w:sectPr>
       <w:pgSz w:w="12240" w:h="15840"/>
@@ -1502,6 +2665,7 @@
   <w:style w:type="character" w:default="1" w:styleId="DefaultParagraphFont">
     <w:name w:val="Default Paragraph Font"/>
     <w:uiPriority w:val="1"/>
+    <w:semiHidden/>
     <w:unhideWhenUsed/>
   </w:style>
   <w:style w:type="table" w:default="1" w:styleId="TableNormal">

</xml_diff>